<commit_message>
Fix list display and add category suggestions
</commit_message>
<xml_diff>
--- a/output/docx/Arjunren_Valdez_IntermediateMobileProg_04TaskPerformance1.docx
+++ b/output/docx/Arjunren_Valdez_IntermediateMobileProg_04TaskPerformance1.docx
@@ -384,7 +384,7 @@
     </w:p>
     <w:p>
       <w:r>
-        <w:t>The project is ready to open using the traditional Visual Studio solution file named AklanDrugstoreInventory.sln. Product and audit data are stored locally as JSON files, so the classroom demonstration does not require a database server or internet connection.</w:t>
+        <w:t>The project is ready to open using the traditional Visual Studio solution file named AklanDrugstoreInventory.sln. Product and audit data are stored in in-memory list collections, so the classroom demonstration does not require SQL, a database server, or internet access. The list resets when the application closes.</w:t>
       </w:r>
     </w:p>
     <w:p>
@@ -1058,7 +1058,7 @@
               <w:rPr>
                 <w:sz w:val="18"/>
               </w:rPr>
-              <w:t>Local storage</w:t>
+              <w:t>List storage</w:t>
             </w:r>
           </w:p>
         </w:tc>
@@ -1090,7 +1090,7 @@
               <w:rPr>
                 <w:sz w:val="18"/>
               </w:rPr>
-              <w:t>Inventory and audit JSON files in application data</w:t>
+              <w:t>In-memory inventory and audit collections for the open session</w:t>
             </w:r>
           </w:p>
         </w:tc>
@@ -1098,6 +1098,101 @@
           <w:tcPr>
             <w:tcW w:type="dxa" w:w="1440"/>
             <w:shd w:fill="EAF2F8"/>
+            <w:tcBorders>
+              <w:top w:val="single" w:sz="6" w:color="D9D9D9"/>
+              <w:left w:val="single" w:sz="6" w:color="D9D9D9"/>
+              <w:bottom w:val="single" w:sz="6" w:color="D9D9D9"/>
+              <w:right w:val="single" w:sz="6" w:color="D9D9D9"/>
+              <w:insideH w:val="single" w:sz="6" w:color="D9D9D9"/>
+              <w:insideV w:val="single" w:sz="6" w:color="D9D9D9"/>
+            </w:tcBorders>
+            <w:tcMar>
+              <w:top w:w="90" w:type="dxa"/>
+              <w:start w:w="110" w:type="dxa"/>
+              <w:bottom w:w="90" w:type="dxa"/>
+              <w:end w:w="110" w:type="dxa"/>
+            </w:tcMar>
+            <w:vAlign w:val="center"/>
+          </w:tcPr>
+          <w:p>
+            <w:pPr>
+              <w:jc w:val="center"/>
+            </w:pPr>
+            <w:r>
+              <w:rPr>
+                <w:sz w:val="18"/>
+              </w:rPr>
+              <w:t>Complete</w:t>
+            </w:r>
+          </w:p>
+        </w:tc>
+      </w:tr>
+      <w:tr>
+        <w:tc>
+          <w:tcPr>
+            <w:tcW w:type="dxa" w:w="2232"/>
+            <w:tcBorders>
+              <w:top w:val="single" w:sz="6" w:color="D9D9D9"/>
+              <w:left w:val="single" w:sz="6" w:color="D9D9D9"/>
+              <w:bottom w:val="single" w:sz="6" w:color="D9D9D9"/>
+              <w:right w:val="single" w:sz="6" w:color="D9D9D9"/>
+              <w:insideH w:val="single" w:sz="6" w:color="D9D9D9"/>
+              <w:insideV w:val="single" w:sz="6" w:color="D9D9D9"/>
+            </w:tcBorders>
+            <w:tcMar>
+              <w:top w:w="90" w:type="dxa"/>
+              <w:start w:w="110" w:type="dxa"/>
+              <w:bottom w:w="90" w:type="dxa"/>
+              <w:end w:w="110" w:type="dxa"/>
+            </w:tcMar>
+            <w:vAlign w:val="center"/>
+          </w:tcPr>
+          <w:p>
+            <w:pPr>
+              <w:jc w:val="center"/>
+            </w:pPr>
+            <w:r>
+              <w:rPr>
+                <w:sz w:val="18"/>
+              </w:rPr>
+              <w:t>Category suggestions</w:t>
+            </w:r>
+          </w:p>
+        </w:tc>
+        <w:tc>
+          <w:tcPr>
+            <w:tcW w:type="dxa" w:w="5544"/>
+            <w:tcBorders>
+              <w:top w:val="single" w:sz="6" w:color="D9D9D9"/>
+              <w:left w:val="single" w:sz="6" w:color="D9D9D9"/>
+              <w:bottom w:val="single" w:sz="6" w:color="D9D9D9"/>
+              <w:right w:val="single" w:sz="6" w:color="D9D9D9"/>
+              <w:insideH w:val="single" w:sz="6" w:color="D9D9D9"/>
+              <w:insideV w:val="single" w:sz="6" w:color="D9D9D9"/>
+            </w:tcBorders>
+            <w:tcMar>
+              <w:top w:w="90" w:type="dxa"/>
+              <w:start w:w="110" w:type="dxa"/>
+              <w:bottom w:w="90" w:type="dxa"/>
+              <w:end w:w="110" w:type="dxa"/>
+            </w:tcMar>
+            <w:vAlign w:val="center"/>
+          </w:tcPr>
+          <w:p>
+            <w:pPr>
+              <w:jc w:val="left"/>
+            </w:pPr>
+            <w:r>
+              <w:rPr>
+                <w:sz w:val="18"/>
+              </w:rPr>
+              <w:t>Filters previously used categories while the user types</w:t>
+            </w:r>
+          </w:p>
+        </w:tc>
+        <w:tc>
+          <w:tcPr>
+            <w:tcW w:type="dxa" w:w="1440"/>
             <w:tcBorders>
               <w:top w:val="single" w:sz="6" w:color="D9D9D9"/>
               <w:left w:val="single" w:sz="6" w:color="D9D9D9"/>
@@ -1595,7 +1690,7 @@
               <w:rPr>
                 <w:sz w:val="18"/>
               </w:rPr>
-              <w:t>Login, navigation, CRUD, validation, persistence, and audit logic</w:t>
+              <w:t>Login, navigation, CRUD, category suggestions, list data, and audit logic</w:t>
             </w:r>
           </w:p>
         </w:tc>
@@ -2606,7 +2701,9 @@
         <w:br/>
         <w:t xml:space="preserve">                    &lt;Label x:Name="LoginMessage" TextColor="#B42318" IsVisible="False" /&gt;</w:t>
         <w:br/>
-        <w:t xml:space="preserve">                    &lt;Button Text="LOG IN" BackgroundColor="#167A53" Clicked="OnLoginClicked" /&gt;</w:t>
+        <w:t xml:space="preserve">                    &lt;Button Text="LOG IN" BackgroundColor="#167A53" TextColor="White"</w:t>
+        <w:br/>
+        <w:t xml:space="preserve">                            Clicked="OnLoginClicked" /&gt;</w:t>
         <w:br/>
         <w:t xml:space="preserve">                    &lt;Label Text="Demo account: admin / admin123" FontSize="12"</w:t>
         <w:br/>
@@ -2810,7 +2907,47 @@
         <w:br/>
         <w:t xml:space="preserve">                                    &lt;Entry x:Name="NameEntry" Style="{StaticResource Field}" Placeholder="Product name" /&gt;</w:t>
         <w:br/>
-        <w:t xml:space="preserve">                                    &lt;Entry x:Name="CategoryEntry" Style="{StaticResource Field}" Placeholder="Category" /&gt;</w:t>
+        <w:t xml:space="preserve">                                    &lt;Entry x:Name="CategoryEntry" Style="{StaticResource Field}" Placeholder="Category"</w:t>
+        <w:br/>
+        <w:t xml:space="preserve">                                           TextChanged="OnCategoryTextChanged" /&gt;</w:t>
+        <w:br/>
+        <w:t xml:space="preserve">                                    &lt;CollectionView x:Name="CategorySuggestionList"</w:t>
+        <w:br/>
+        <w:t xml:space="preserve">                                                    ItemsSource="{Binding CategorySuggestions}"</w:t>
+        <w:br/>
+        <w:t xml:space="preserve">                                                    IsVisible="False"</w:t>
+        <w:br/>
+        <w:t xml:space="preserve">                                                    HeightRequest="92"</w:t>
+        <w:br/>
+        <w:t xml:space="preserve">                                                    SelectionMode="None"</w:t>
+        <w:br/>
+        <w:t xml:space="preserve">                                                    BackgroundColor="#F0F7F3"&gt;</w:t>
+        <w:br/>
+        <w:t xml:space="preserve">                                        &lt;CollectionView.ItemTemplate&gt;</w:t>
+        <w:br/>
+        <w:t xml:space="preserve">                                            &lt;DataTemplate&gt;</w:t>
+        <w:br/>
+        <w:t xml:space="preserve">                                                &lt;Button Text="{Binding .}"</w:t>
+        <w:br/>
+        <w:t xml:space="preserve">                                                        CommandParameter="{Binding .}"</w:t>
+        <w:br/>
+        <w:t xml:space="preserve">                                                        Clicked="OnCategorySuggestionClicked"</w:t>
+        <w:br/>
+        <w:t xml:space="preserve">                                                        BackgroundColor="#E8F2ED"</w:t>
+        <w:br/>
+        <w:t xml:space="preserve">                                                        TextColor="#19352A"</w:t>
+        <w:br/>
+        <w:t xml:space="preserve">                                                        FontSize="13"</w:t>
+        <w:br/>
+        <w:t xml:space="preserve">                                                        HeightRequest="38"</w:t>
+        <w:br/>
+        <w:t xml:space="preserve">                                                        Padding="10,4" /&gt;</w:t>
+        <w:br/>
+        <w:t xml:space="preserve">                                            &lt;/DataTemplate&gt;</w:t>
+        <w:br/>
+        <w:t xml:space="preserve">                                        &lt;/CollectionView.ItemTemplate&gt;</w:t>
+        <w:br/>
+        <w:t xml:space="preserve">                                    &lt;/CollectionView&gt;</w:t>
         <w:br/>
         <w:t xml:space="preserve">                                    &lt;Entry x:Name="QuantityEntry" Style="{StaticResource Field}" Placeholder="Quantity"</w:t>
         <w:br/>
@@ -2820,23 +2957,33 @@
         <w:br/>
         <w:t xml:space="preserve">                                           Keyboard="Numeric" /&gt;</w:t>
         <w:br/>
-        <w:t xml:space="preserve">                                    &lt;DatePicker x:Name="ExpiryPicker" MinimumDate="2024-01-01" /&gt;</w:t>
+        <w:t xml:space="preserve">                                    &lt;DatePicker x:Name="ExpiryPicker" MinimumDate="2024-01-01"</w:t>
+        <w:br/>
+        <w:t xml:space="preserve">                                                TextColor="#19352A" /&gt;</w:t>
         <w:br/>
         <w:t xml:space="preserve">                                    &lt;Label x:Name="FormMessage" FontSize="12" TextColor="#B42318" IsVisible="False" /&gt;</w:t>
         <w:br/>
         <w:t xml:space="preserve">                                    &lt;Grid ColumnDefinitions="*,*" ColumnSpacing="8"&gt;</w:t>
         <w:br/>
-        <w:t xml:space="preserve">                                        &lt;Button Text="Add" BackgroundColor="#167A53" Clicked="OnAddClicked" /&gt;</w:t>
-        <w:br/>
-        <w:t xml:space="preserve">                                        &lt;Button Grid.Column="1" Text="Update" BackgroundColor="#2F6F9F" Clicked="OnUpdateClicked" /&gt;</w:t>
+        <w:t xml:space="preserve">                                        &lt;Button Text="Add" BackgroundColor="#167A53" TextColor="White"</w:t>
+        <w:br/>
+        <w:t xml:space="preserve">                                                Clicked="OnAddClicked" /&gt;</w:t>
+        <w:br/>
+        <w:t xml:space="preserve">                                        &lt;Button Grid.Column="1" Text="Update" BackgroundColor="#2F6F9F"</w:t>
+        <w:br/>
+        <w:t xml:space="preserve">                                                TextColor="White" Clicked="OnUpdateClicked" /&gt;</w:t>
         <w:br/>
         <w:t xml:space="preserve">                                    &lt;/Grid&gt;</w:t>
         <w:br/>
         <w:t xml:space="preserve">                                    &lt;Grid ColumnDefinitions="*,*" ColumnSpacing="8"&gt;</w:t>
         <w:br/>
-        <w:t xml:space="preserve">                                        &lt;Button Text="Delete" BackgroundColor="#B33A3A" Clicked="OnDeleteClicked" /&gt;</w:t>
-        <w:br/>
-        <w:t xml:space="preserve">                                        &lt;Button Grid.Column="1" Text="Clear" BackgroundColor="#687873" Clicked="OnClearClicked" /&gt;</w:t>
+        <w:t xml:space="preserve">                                        &lt;Button Text="Delete" BackgroundColor="#B33A3A" TextColor="White"</w:t>
+        <w:br/>
+        <w:t xml:space="preserve">                                                Clicked="OnDeleteClicked" /&gt;</w:t>
+        <w:br/>
+        <w:t xml:space="preserve">                                        &lt;Button Grid.Column="1" Text="Clear" BackgroundColor="#687873"</w:t>
+        <w:br/>
+        <w:t xml:space="preserve">                                                TextColor="White" Clicked="OnClearClicked" /&gt;</w:t>
         <w:br/>
         <w:t xml:space="preserve">                                    &lt;/Grid&gt;</w:t>
         <w:br/>
@@ -2857,15 +3004,15 @@
         <w:br/>
         <w:t xml:space="preserve">                                    &lt;Grid ColumnDefinitions="2*,1.2*,.7*,.8*,1.1*" Padding="8,6" BackgroundColor="#E8F2ED"&gt;</w:t>
         <w:br/>
-        <w:t xml:space="preserve">                                        &lt;Label Text="Product" FontFamily="OpenSansSemibold" /&gt;</w:t>
-        <w:br/>
-        <w:t xml:space="preserve">                                        &lt;Label Grid.Column="1" Text="Category" FontFamily="OpenSansSemibold" /&gt;</w:t>
-        <w:br/>
-        <w:t xml:space="preserve">                                        &lt;Label Grid.Column="2" Text="Qty" FontFamily="OpenSansSemibold" /&gt;</w:t>
-        <w:br/>
-        <w:t xml:space="preserve">                                        &lt;Label Grid.Column="3" Text="Price" FontFamily="OpenSansSemibold" /&gt;</w:t>
-        <w:br/>
-        <w:t xml:space="preserve">                                        &lt;Label Grid.Column="4" Text="Expiry" FontFamily="OpenSansSemibold" /&gt;</w:t>
+        <w:t xml:space="preserve">                                        &lt;Label Text="Product" FontFamily="OpenSansSemibold" TextColor="#234438" /&gt;</w:t>
+        <w:br/>
+        <w:t xml:space="preserve">                                        &lt;Label Grid.Column="1" Text="Category" FontFamily="OpenSansSemibold" TextColor="#234438" /&gt;</w:t>
+        <w:br/>
+        <w:t xml:space="preserve">                                        &lt;Label Grid.Column="2" Text="Qty" FontFamily="OpenSansSemibold" TextColor="#234438" /&gt;</w:t>
+        <w:br/>
+        <w:t xml:space="preserve">                                        &lt;Label Grid.Column="3" Text="Price" FontFamily="OpenSansSemibold" TextColor="#234438" /&gt;</w:t>
+        <w:br/>
+        <w:t xml:space="preserve">                                        &lt;Label Grid.Column="4" Text="Expiry" FontFamily="OpenSansSemibold" TextColor="#234438" /&gt;</w:t>
         <w:br/>
         <w:t xml:space="preserve">                                    &lt;/Grid&gt;</w:t>
         <w:br/>
@@ -2875,17 +3022,19 @@
         <w:br/>
         <w:t xml:space="preserve">                                    &lt;DataTemplate x:DataType="models:InventoryItem"&gt;</w:t>
         <w:br/>
-        <w:t xml:space="preserve">                                        &lt;Grid ColumnDefinitions="2*,1.2*,.7*,.8*,1.1*" Padding="8,10"&gt;</w:t>
-        <w:br/>
-        <w:t xml:space="preserve">                                            &lt;Label Text="{Binding Name}" LineBreakMode="TailTruncation" /&gt;</w:t>
-        <w:br/>
-        <w:t xml:space="preserve">                                            &lt;Label Grid.Column="1" Text="{Binding Category}" LineBreakMode="TailTruncation" /&gt;</w:t>
-        <w:br/>
-        <w:t xml:space="preserve">                                            &lt;Label Grid.Column="2" Text="{Binding Quantity}" /&gt;</w:t>
-        <w:br/>
-        <w:t xml:space="preserve">                                            &lt;Label Grid.Column="3" Text="{Binding Price, StringFormat='{0:F2}'}" /&gt;</w:t>
-        <w:br/>
-        <w:t xml:space="preserve">                                            &lt;Label Grid.Column="4" Text="{Binding ExpiryDate, StringFormat='{0:MMM dd, yyyy}'}" /&gt;</w:t>
+        <w:t xml:space="preserve">                                        &lt;Grid ColumnDefinitions="2*,1.2*,.7*,.8*,1.1*" Padding="8,10"</w:t>
+        <w:br/>
+        <w:t xml:space="preserve">                                              HorizontalOptions="Fill"&gt;</w:t>
+        <w:br/>
+        <w:t xml:space="preserve">                                            &lt;Label Text="{Binding Name}" LineBreakMode="TailTruncation" TextColor="#2E443B" /&gt;</w:t>
+        <w:br/>
+        <w:t xml:space="preserve">                                            &lt;Label Grid.Column="1" Text="{Binding Category}" LineBreakMode="TailTruncation" TextColor="#2E443B" /&gt;</w:t>
+        <w:br/>
+        <w:t xml:space="preserve">                                            &lt;Label Grid.Column="2" Text="{Binding Quantity}" TextColor="#2E443B" /&gt;</w:t>
+        <w:br/>
+        <w:t xml:space="preserve">                                            &lt;Label Grid.Column="3" Text="{Binding Price, StringFormat='{0:F2}'}" TextColor="#2E443B" /&gt;</w:t>
+        <w:br/>
+        <w:t xml:space="preserve">                                            &lt;Label Grid.Column="4" Text="{Binding ExpiryDate, StringFormat='{0:MMM dd, yyyy}'}" TextColor="#2E443B" /&gt;</w:t>
         <w:br/>
         <w:t xml:space="preserve">                                        &lt;/Grid&gt;</w:t>
         <w:br/>
@@ -2926,19 +3075,37 @@
         <w:br/>
         <w:t xml:space="preserve">                        &lt;CollectionView ItemsSource="{Binding AuditEntries}"&gt;</w:t>
         <w:br/>
+        <w:t xml:space="preserve">                            &lt;CollectionView.Header&gt;</w:t>
+        <w:br/>
+        <w:t xml:space="preserve">                                &lt;Grid ColumnDefinitions="160,120,*" Padding="8,7" BackgroundColor="#E8F2ED"&gt;</w:t>
+        <w:br/>
+        <w:t xml:space="preserve">                                    &lt;Label Text="Date and time" FontFamily="OpenSansSemibold" TextColor="#234438" /&gt;</w:t>
+        <w:br/>
+        <w:t xml:space="preserve">                                    &lt;Label Grid.Column="1" Text="Action" FontFamily="OpenSansSemibold" TextColor="#234438" /&gt;</w:t>
+        <w:br/>
+        <w:t xml:space="preserve">                                    &lt;Label Grid.Column="2" Text="Details" FontFamily="OpenSansSemibold" TextColor="#234438" /&gt;</w:t>
+        <w:br/>
+        <w:t xml:space="preserve">                                &lt;/Grid&gt;</w:t>
+        <w:br/>
+        <w:t xml:space="preserve">                            &lt;/CollectionView.Header&gt;</w:t>
+        <w:br/>
         <w:t xml:space="preserve">                            &lt;CollectionView.ItemTemplate&gt;</w:t>
         <w:br/>
         <w:t xml:space="preserve">                                &lt;DataTemplate x:DataType="models:AuditEntry"&gt;</w:t>
         <w:br/>
-        <w:t xml:space="preserve">                                    &lt;Grid ColumnDefinitions="160,120,*" Padding="8,11"&gt;</w:t>
-        <w:br/>
-        <w:t xml:space="preserve">                                        &lt;Label Text="{Binding Time, StringFormat='{0:MMM dd, yyyy HH:mm}'}" FontSize="12" /&gt;</w:t>
+        <w:t xml:space="preserve">                                    &lt;Grid ColumnDefinitions="160,120,*" Padding="8,11" HorizontalOptions="Fill"&gt;</w:t>
+        <w:br/>
+        <w:t xml:space="preserve">                                        &lt;Label Text="{Binding Time, StringFormat='{0:MMM dd, yyyy HH:mm}'}"</w:t>
+        <w:br/>
+        <w:t xml:space="preserve">                                               FontSize="12" TextColor="#2E443B" /&gt;</w:t>
         <w:br/>
         <w:t xml:space="preserve">                                        &lt;Label Grid.Column="1" Text="{Binding Action}" FontFamily="OpenSansSemibold"</w:t>
         <w:br/>
         <w:t xml:space="preserve">                                               TextColor="#167A53" /&gt;</w:t>
         <w:br/>
-        <w:t xml:space="preserve">                                        &lt;Label Grid.Column="2" Text="{Binding Details}" LineBreakMode="WordWrap" /&gt;</w:t>
+        <w:t xml:space="preserve">                                        &lt;Label Grid.Column="2" Text="{Binding Details}" LineBreakMode="WordWrap"</w:t>
+        <w:br/>
+        <w:t xml:space="preserve">                                               TextColor="#2E443B" /&gt;</w:t>
         <w:br/>
         <w:t xml:space="preserve">                                    &lt;/Grid&gt;</w:t>
         <w:br/>
@@ -3000,8 +3167,6 @@
         </w:rPr>
         <w:t>using System.Collections.ObjectModel;</w:t>
         <w:br/>
-        <w:t>using System.Text.Json;</w:t>
-        <w:br/>
         <w:t>using AklanDrugstoreInventory.Models;</w:t>
         <w:br/>
         <w:br/>
@@ -3012,10 +3177,6 @@
         <w:br/>
         <w:t>{</w:t>
         <w:br/>
-        <w:t xml:space="preserve">    private readonly string inventoryFile = Path.Combine(FileSystem.AppDataDirectory, "inventory.json");</w:t>
-        <w:br/>
-        <w:t xml:space="preserve">    private readonly string auditFile = Path.Combine(FileSystem.AppDataDirectory, "audit.json");</w:t>
-        <w:br/>
         <w:t xml:space="preserve">    private InventoryItem? selectedItem;</w:t>
         <w:br/>
         <w:t xml:space="preserve">    private bool dataLoaded;</w:t>
@@ -3025,6 +3186,8 @@
         <w:br/>
         <w:t xml:space="preserve">    public ObservableCollection&lt;AuditEntry&gt; AuditEntries { get; } = [];</w:t>
         <w:br/>
+        <w:t xml:space="preserve">    public ObservableCollection&lt;string&gt; CategorySuggestions { get; } = [];</w:t>
+        <w:br/>
         <w:br/>
         <w:t xml:space="preserve">    public MainPage()</w:t>
         <w:br/>
@@ -3039,7 +3202,7 @@
         <w:t xml:space="preserve">    }</w:t>
         <w:br/>
         <w:br/>
-        <w:t xml:space="preserve">    protected override async void OnAppearing()</w:t>
+        <w:t xml:space="preserve">    protected override void OnAppearing()</w:t>
         <w:br/>
         <w:t xml:space="preserve">    {</w:t>
         <w:br/>
@@ -3052,7 +3215,7 @@
         <w:br/>
         <w:t xml:space="preserve">        dataLoaded = true;</w:t>
         <w:br/>
-        <w:t xml:space="preserve">        await LoadDataAsync();</w:t>
+        <w:t xml:space="preserve">        LoadSampleData();</w:t>
         <w:br/>
         <w:t xml:space="preserve">        UpdateDashboard();</w:t>
         <w:br/>
@@ -3128,7 +3291,7 @@
         <w:t xml:space="preserve">    }</w:t>
         <w:br/>
         <w:br/>
-        <w:t xml:space="preserve">    private async void OnAddClicked(object? sender, EventArgs e)</w:t>
+        <w:t xml:space="preserve">    private void OnAddClicked(object? sender, EventArgs e)</w:t>
         <w:br/>
         <w:t xml:space="preserve">    {</w:t>
         <w:br/>
@@ -3160,8 +3323,6 @@
         <w:br/>
         <w:t xml:space="preserve">        AddAudit("ADD", $"Added {item.Name} with {item.Quantity} unit(s).");</w:t>
         <w:br/>
-        <w:t xml:space="preserve">        await SaveDataAsync();</w:t>
-        <w:br/>
         <w:t xml:space="preserve">        ClearForm();</w:t>
         <w:br/>
         <w:t xml:space="preserve">        UpdateDashboard();</w:t>
@@ -3169,7 +3330,7 @@
         <w:t xml:space="preserve">    }</w:t>
         <w:br/>
         <w:br/>
-        <w:t xml:space="preserve">    private async void OnUpdateClicked(object? sender, EventArgs e)</w:t>
+        <w:t xml:space="preserve">    private void OnUpdateClicked(object? sender, EventArgs e)</w:t>
         <w:br/>
         <w:t xml:space="preserve">    {</w:t>
         <w:br/>
@@ -3204,8 +3365,6 @@
         <w:br/>
         <w:t xml:space="preserve">        AddAudit("UPDATE", $"Updated {oldName} to {selectedItem.Name} ({selectedItem.Quantity} unit(s)).");</w:t>
         <w:br/>
-        <w:t xml:space="preserve">        await SaveDataAsync();</w:t>
-        <w:br/>
         <w:t xml:space="preserve">        ClearForm();</w:t>
         <w:br/>
         <w:t xml:space="preserve">        UpdateDashboard();</w:t>
@@ -3241,8 +3400,6 @@
         <w:br/>
         <w:t xml:space="preserve">        AddAudit("DELETE", $"Deleted {productName}.");</w:t>
         <w:br/>
-        <w:t xml:space="preserve">        await SaveDataAsync();</w:t>
-        <w:br/>
         <w:t xml:space="preserve">        ClearForm();</w:t>
         <w:br/>
         <w:t xml:space="preserve">        UpdateDashboard();</w:t>
@@ -3253,6 +3410,67 @@
         <w:t xml:space="preserve">    private void OnClearClicked(object? sender, EventArgs e) =&gt; ClearForm();</w:t>
         <w:br/>
         <w:br/>
+        <w:t xml:space="preserve">    private void OnCategoryTextChanged(object? sender, TextChangedEventArgs e)</w:t>
+        <w:br/>
+        <w:t xml:space="preserve">    {</w:t>
+        <w:br/>
+        <w:t xml:space="preserve">        string query = e.NewTextValue?.Trim() ?? string.Empty;</w:t>
+        <w:br/>
+        <w:t xml:space="preserve">        CategorySuggestions.Clear();</w:t>
+        <w:br/>
+        <w:br/>
+        <w:t xml:space="preserve">        if (string.IsNullOrWhiteSpace(query) ||</w:t>
+        <w:br/>
+        <w:t xml:space="preserve">            Items.Any(item =&gt; item.Category.Equals(query, StringComparison.OrdinalIgnoreCase)))</w:t>
+        <w:br/>
+        <w:t xml:space="preserve">        {</w:t>
+        <w:br/>
+        <w:t xml:space="preserve">            CategorySuggestionList.IsVisible = false;</w:t>
+        <w:br/>
+        <w:t xml:space="preserve">            return;</w:t>
+        <w:br/>
+        <w:t xml:space="preserve">        }</w:t>
+        <w:br/>
+        <w:br/>
+        <w:t xml:space="preserve">        IEnumerable&lt;string&gt; matches = Items</w:t>
+        <w:br/>
+        <w:t xml:space="preserve">            .Select(item =&gt; item.Category)</w:t>
+        <w:br/>
+        <w:t xml:space="preserve">            .Where(category =&gt; category.Contains(query, StringComparison.OrdinalIgnoreCase))</w:t>
+        <w:br/>
+        <w:t xml:space="preserve">            .Distinct(StringComparer.OrdinalIgnoreCase)</w:t>
+        <w:br/>
+        <w:t xml:space="preserve">            .OrderBy(category =&gt; category)</w:t>
+        <w:br/>
+        <w:t xml:space="preserve">            .Take(5);</w:t>
+        <w:br/>
+        <w:br/>
+        <w:t xml:space="preserve">        foreach (string category in matches)</w:t>
+        <w:br/>
+        <w:t xml:space="preserve">            CategorySuggestions.Add(category);</w:t>
+        <w:br/>
+        <w:br/>
+        <w:t xml:space="preserve">        CategorySuggestionList.IsVisible = CategorySuggestions.Count &gt; 0;</w:t>
+        <w:br/>
+        <w:t xml:space="preserve">    }</w:t>
+        <w:br/>
+        <w:br/>
+        <w:t xml:space="preserve">    private void OnCategorySuggestionClicked(object? sender, EventArgs e)</w:t>
+        <w:br/>
+        <w:t xml:space="preserve">    {</w:t>
+        <w:br/>
+        <w:t xml:space="preserve">        if (sender is not Button button || button.CommandParameter is not string category)</w:t>
+        <w:br/>
+        <w:t xml:space="preserve">            return;</w:t>
+        <w:br/>
+        <w:br/>
+        <w:t xml:space="preserve">        CategoryEntry.Text = category;</w:t>
+        <w:br/>
+        <w:t xml:space="preserve">        CategorySuggestionList.IsVisible = false;</w:t>
+        <w:br/>
+        <w:t xml:space="preserve">    }</w:t>
+        <w:br/>
+        <w:br/>
         <w:t xml:space="preserve">    private void OnInventorySelectionChanged(object? sender, SelectionChangedEventArgs e)</w:t>
         <w:br/>
         <w:t xml:space="preserve">    {</w:t>
@@ -3333,6 +3551,10 @@
         <w:br/>
         <w:t xml:space="preserve">        CategoryEntry.Text = string.Empty;</w:t>
         <w:br/>
+        <w:t xml:space="preserve">        CategorySuggestionList.IsVisible = false;</w:t>
+        <w:br/>
+        <w:t xml:space="preserve">        CategorySuggestions.Clear();</w:t>
+        <w:br/>
         <w:t xml:space="preserve">        QuantityEntry.Text = string.Empty;</w:t>
         <w:br/>
         <w:t xml:space="preserve">        PriceEntry.Text = string.Empty;</w:t>
@@ -3374,92 +3596,20 @@
         <w:t xml:space="preserve">        });</w:t>
         <w:br/>
         <w:br/>
-        <w:t xml:space="preserve">        _ = SaveAuditAsync();</w:t>
-        <w:br/>
         <w:t xml:space="preserve">    }</w:t>
         <w:br/>
         <w:br/>
-        <w:t xml:space="preserve">    private async Task LoadDataAsync()</w:t>
+        <w:t xml:space="preserve">    private void LoadSampleData()</w:t>
         <w:br/>
         <w:t xml:space="preserve">    {</w:t>
         <w:br/>
-        <w:t xml:space="preserve">        try</w:t>
-        <w:br/>
-        <w:t xml:space="preserve">        {</w:t>
-        <w:br/>
-        <w:t xml:space="preserve">            if (File.Exists(inventoryFile))</w:t>
-        <w:br/>
-        <w:t xml:space="preserve">            {</w:t>
-        <w:br/>
-        <w:t xml:space="preserve">                string json = await File.ReadAllTextAsync(inventoryFile);</w:t>
-        <w:br/>
-        <w:t xml:space="preserve">                foreach (InventoryItem item in JsonSerializer.Deserialize&lt;List&lt;InventoryItem&gt;&gt;(json) ?? [])</w:t>
-        <w:br/>
-        <w:t xml:space="preserve">                    Items.Add(item);</w:t>
-        <w:br/>
-        <w:t xml:space="preserve">            }</w:t>
-        <w:br/>
-        <w:br/>
-        <w:t xml:space="preserve">            if (File.Exists(auditFile))</w:t>
-        <w:br/>
-        <w:t xml:space="preserve">            {</w:t>
-        <w:br/>
-        <w:t xml:space="preserve">                string json = await File.ReadAllTextAsync(auditFile);</w:t>
-        <w:br/>
-        <w:t xml:space="preserve">                foreach (AuditEntry entry in JsonSerializer.Deserialize&lt;List&lt;AuditEntry&gt;&gt;(json) ?? [])</w:t>
-        <w:br/>
-        <w:t xml:space="preserve">                    AuditEntries.Add(entry);</w:t>
-        <w:br/>
-        <w:t xml:space="preserve">            }</w:t>
-        <w:br/>
-        <w:t xml:space="preserve">        }</w:t>
-        <w:br/>
-        <w:t xml:space="preserve">        catch</w:t>
-        <w:br/>
-        <w:t xml:space="preserve">        {</w:t>
-        <w:br/>
-        <w:t xml:space="preserve">            // A damaged local file should not prevent the student demo from opening.</w:t>
-        <w:br/>
-        <w:t xml:space="preserve">        }</w:t>
-        <w:br/>
-        <w:br/>
-        <w:t xml:space="preserve">        if (Items.Count == 0)</w:t>
-        <w:br/>
-        <w:t xml:space="preserve">        {</w:t>
-        <w:br/>
-        <w:t xml:space="preserve">            Items.Add(new InventoryItem { Id = Guid.NewGuid(), Name = "Paracetamol 500mg", Category = "Medicine", Quantity = 25, Price = 5.50m, ExpiryDate = DateTime.Today.AddYears(2) });</w:t>
-        <w:br/>
-        <w:t xml:space="preserve">            Items.Add(new InventoryItem { Id = Guid.NewGuid(), Name = "Vitamin C", Category = "Vitamins", Quantity = 18, Price = 8.00m, ExpiryDate = DateTime.Today.AddYears(1) });</w:t>
-        <w:br/>
-        <w:t xml:space="preserve">            Items.Add(new InventoryItem { Id = Guid.NewGuid(), Name = "Alcohol 70%", Category = "First Aid", Quantity = 9, Price = 45.00m, ExpiryDate = DateTime.Today.AddMonths(18) });</w:t>
-        <w:br/>
-        <w:t xml:space="preserve">            Items.Add(new InventoryItem { Id = Guid.NewGuid(), Name = "Face Mask", Category = "Supplies", Quantity = 32, Price = 3.00m, ExpiryDate = DateTime.Today.AddYears(3) });</w:t>
-        <w:br/>
-        <w:t xml:space="preserve">            await SaveDataAsync();</w:t>
-        <w:br/>
-        <w:t xml:space="preserve">        }</w:t>
-        <w:br/>
-        <w:t xml:space="preserve">    }</w:t>
-        <w:br/>
-        <w:br/>
-        <w:t xml:space="preserve">    private async Task SaveDataAsync()</w:t>
-        <w:br/>
-        <w:t xml:space="preserve">    {</w:t>
-        <w:br/>
-        <w:t xml:space="preserve">        string json = JsonSerializer.Serialize(Items, new JsonSerializerOptions { WriteIndented = true });</w:t>
-        <w:br/>
-        <w:t xml:space="preserve">        await File.WriteAllTextAsync(inventoryFile, json);</w:t>
-        <w:br/>
-        <w:t xml:space="preserve">    }</w:t>
-        <w:br/>
-        <w:br/>
-        <w:t xml:space="preserve">    private async Task SaveAuditAsync()</w:t>
-        <w:br/>
-        <w:t xml:space="preserve">    {</w:t>
-        <w:br/>
-        <w:t xml:space="preserve">        string json = JsonSerializer.Serialize(AuditEntries, new JsonSerializerOptions { WriteIndented = true });</w:t>
-        <w:br/>
-        <w:t xml:space="preserve">        await File.WriteAllTextAsync(auditFile, json);</w:t>
+        <w:t xml:space="preserve">        Items.Add(new InventoryItem { Id = Guid.NewGuid(), Name = "Paracetamol 500mg", Category = "Medicine", Quantity = 25, Price = 5.50m, ExpiryDate = DateTime.Today.AddYears(2) });</w:t>
+        <w:br/>
+        <w:t xml:space="preserve">        Items.Add(new InventoryItem { Id = Guid.NewGuid(), Name = "Vitamin C", Category = "Vitamins", Quantity = 18, Price = 8.00m, ExpiryDate = DateTime.Today.AddYears(1) });</w:t>
+        <w:br/>
+        <w:t xml:space="preserve">        Items.Add(new InventoryItem { Id = Guid.NewGuid(), Name = "Alcohol 70%", Category = "First Aid", Quantity = 9, Price = 45.00m, ExpiryDate = DateTime.Today.AddMonths(18) });</w:t>
+        <w:br/>
+        <w:t xml:space="preserve">        Items.Add(new InventoryItem { Id = Guid.NewGuid(), Name = "Face Mask", Category = "Supplies", Quantity = 32, Price = 3.00m, ExpiryDate = DateTime.Today.AddYears(3) });</w:t>
         <w:br/>
         <w:t xml:space="preserve">    }</w:t>
         <w:br/>

</xml_diff>